<commit_message>
Add 500-molecule database with verified names, images and gallery
Acyclic alkanes through amines with modern and classic IUPAC names (all
checked against OPSIN), skeletal drawings, CSV/JSON, searchable gallery and
a lookup helper. Moves the shared drawing module to organic-chemistry/_shared
and fixes a transparent-edge artifact in generated images.

Co-Authored-By: Claude Sonnet 5.5 <noreply@anthropic.com>
Claude-Session: https://claude.ai/code/session_01Q567TpajQd7bmbFDieU89t
</commit_message>
<xml_diff>
--- a/organic-chemistry/acids-bases/Acids_Bases_Nomenclature_Quiz.docx
+++ b/organic-chemistry/acids-bases/Acids_Bases_Nomenclature_Quiz.docx
@@ -74,7 +74,7 @@
             <w:r>
               <w:drawing>
                 <wp:inline xmlns:a="http://schemas.openxmlformats.org/drawingml/2006/main" xmlns:pic="http://schemas.openxmlformats.org/drawingml/2006/picture">
-                  <wp:extent cx="1975104" cy="980237"/>
+                  <wp:extent cx="2150668" cy="987552"/>
                   <wp:docPr id="1" name="Picture 1"/>
                   <wp:cNvGraphicFramePr>
                     <a:graphicFrameLocks noChangeAspect="1"/>
@@ -95,7 +95,7 @@
                         <pic:spPr>
                           <a:xfrm>
                             <a:off x="0" y="0"/>
-                            <a:ext cx="1975104" cy="980237"/>
+                            <a:ext cx="2150668" cy="987552"/>
                           </a:xfrm>
                           <a:prstGeom prst="rect"/>
                         </pic:spPr>
@@ -183,7 +183,7 @@
             <w:r>
               <w:drawing>
                 <wp:inline xmlns:a="http://schemas.openxmlformats.org/drawingml/2006/main" xmlns:pic="http://schemas.openxmlformats.org/drawingml/2006/picture">
-                  <wp:extent cx="2275027" cy="980237"/>
+                  <wp:extent cx="2457907" cy="987552"/>
                   <wp:docPr id="2" name="Picture 2"/>
                   <wp:cNvGraphicFramePr>
                     <a:graphicFrameLocks noChangeAspect="1"/>
@@ -204,7 +204,7 @@
                         <pic:spPr>
                           <a:xfrm>
                             <a:off x="0" y="0"/>
-                            <a:ext cx="2275027" cy="980237"/>
+                            <a:ext cx="2457907" cy="987552"/>
                           </a:xfrm>
                           <a:prstGeom prst="rect"/>
                         </pic:spPr>
@@ -292,7 +292,7 @@
             <w:r>
               <w:drawing>
                 <wp:inline xmlns:a="http://schemas.openxmlformats.org/drawingml/2006/main" xmlns:pic="http://schemas.openxmlformats.org/drawingml/2006/picture">
-                  <wp:extent cx="2882188" cy="1514246"/>
+                  <wp:extent cx="3065068" cy="1514246"/>
                   <wp:docPr id="3" name="Picture 3"/>
                   <wp:cNvGraphicFramePr>
                     <a:graphicFrameLocks noChangeAspect="1"/>
@@ -313,7 +313,7 @@
                         <pic:spPr>
                           <a:xfrm>
                             <a:off x="0" y="0"/>
-                            <a:ext cx="2882188" cy="1514246"/>
+                            <a:ext cx="3065068" cy="1514246"/>
                           </a:xfrm>
                           <a:prstGeom prst="rect"/>
                         </pic:spPr>
@@ -401,7 +401,7 @@
             <w:r>
               <w:drawing>
                 <wp:inline xmlns:a="http://schemas.openxmlformats.org/drawingml/2006/main" xmlns:pic="http://schemas.openxmlformats.org/drawingml/2006/picture">
-                  <wp:extent cx="3123590" cy="629107"/>
+                  <wp:extent cx="3299155" cy="636422"/>
                   <wp:docPr id="4" name="Picture 4"/>
                   <wp:cNvGraphicFramePr>
                     <a:graphicFrameLocks noChangeAspect="1"/>
@@ -422,7 +422,7 @@
                         <pic:spPr>
                           <a:xfrm>
                             <a:off x="0" y="0"/>
-                            <a:ext cx="3123590" cy="629107"/>
+                            <a:ext cx="3299155" cy="636422"/>
                           </a:xfrm>
                           <a:prstGeom prst="rect"/>
                         </pic:spPr>
@@ -510,7 +510,7 @@
             <w:r>
               <w:drawing>
                 <wp:inline xmlns:a="http://schemas.openxmlformats.org/drawingml/2006/main" xmlns:pic="http://schemas.openxmlformats.org/drawingml/2006/picture">
-                  <wp:extent cx="2582265" cy="1331366"/>
+                  <wp:extent cx="2757830" cy="1331366"/>
                   <wp:docPr id="5" name="Picture 5"/>
                   <wp:cNvGraphicFramePr>
                     <a:graphicFrameLocks noChangeAspect="1"/>
@@ -531,7 +531,7 @@
                         <pic:spPr>
                           <a:xfrm>
                             <a:off x="0" y="0"/>
-                            <a:ext cx="2582265" cy="1331366"/>
+                            <a:ext cx="2757830" cy="1331366"/>
                           </a:xfrm>
                           <a:prstGeom prst="rect"/>
                         </pic:spPr>
@@ -619,7 +619,7 @@
             <w:r>
               <w:drawing>
                 <wp:inline xmlns:a="http://schemas.openxmlformats.org/drawingml/2006/main" xmlns:pic="http://schemas.openxmlformats.org/drawingml/2006/picture">
-                  <wp:extent cx="1667865" cy="2033625"/>
+                  <wp:extent cx="1850745" cy="2040940"/>
                   <wp:docPr id="6" name="Picture 6"/>
                   <wp:cNvGraphicFramePr>
                     <a:graphicFrameLocks noChangeAspect="1"/>
@@ -640,7 +640,7 @@
                         <pic:spPr>
                           <a:xfrm>
                             <a:off x="0" y="0"/>
-                            <a:ext cx="1667865" cy="2033625"/>
+                            <a:ext cx="1850745" cy="2040940"/>
                           </a:xfrm>
                           <a:prstGeom prst="rect"/>
                         </pic:spPr>
@@ -728,7 +728,7 @@
             <w:r>
               <w:drawing>
                 <wp:inline xmlns:a="http://schemas.openxmlformats.org/drawingml/2006/main" xmlns:pic="http://schemas.openxmlformats.org/drawingml/2006/picture">
-                  <wp:extent cx="1068019" cy="2560320"/>
+                  <wp:extent cx="1243584" cy="2560320"/>
                   <wp:docPr id="7" name="Picture 7"/>
                   <wp:cNvGraphicFramePr>
                     <a:graphicFrameLocks noChangeAspect="1"/>
@@ -749,7 +749,7 @@
                         <pic:spPr>
                           <a:xfrm>
                             <a:off x="0" y="0"/>
-                            <a:ext cx="1068019" cy="2560320"/>
+                            <a:ext cx="1243584" cy="2560320"/>
                           </a:xfrm>
                           <a:prstGeom prst="rect"/>
                         </pic:spPr>
@@ -837,7 +837,7 @@
             <w:r>
               <w:drawing>
                 <wp:inline xmlns:a="http://schemas.openxmlformats.org/drawingml/2006/main" xmlns:pic="http://schemas.openxmlformats.org/drawingml/2006/picture">
-                  <wp:extent cx="2889504" cy="1331366"/>
+                  <wp:extent cx="3065068" cy="1338681"/>
                   <wp:docPr id="8" name="Picture 8"/>
                   <wp:cNvGraphicFramePr>
                     <a:graphicFrameLocks noChangeAspect="1"/>
@@ -858,7 +858,7 @@
                         <pic:spPr>
                           <a:xfrm>
                             <a:off x="0" y="0"/>
-                            <a:ext cx="2889504" cy="1331366"/>
+                            <a:ext cx="3065068" cy="1338681"/>
                           </a:xfrm>
                           <a:prstGeom prst="rect"/>
                         </pic:spPr>
@@ -959,7 +959,7 @@
                   <w:r>
                     <w:drawing>
                       <wp:inline xmlns:a="http://schemas.openxmlformats.org/drawingml/2006/main" xmlns:pic="http://schemas.openxmlformats.org/drawingml/2006/picture">
-                        <wp:extent cx="1484985" cy="980236"/>
+                        <wp:extent cx="1484985" cy="987552"/>
                         <wp:docPr id="9" name="Picture 9"/>
                         <wp:cNvGraphicFramePr>
                           <a:graphicFrameLocks noChangeAspect="1"/>
@@ -980,7 +980,7 @@
                               <pic:spPr>
                                 <a:xfrm>
                                   <a:off x="0" y="0"/>
-                                  <a:ext cx="1484985" cy="980236"/>
+                                  <a:ext cx="1484985" cy="987552"/>
                                 </a:xfrm>
                                 <a:prstGeom prst="rect"/>
                               </pic:spPr>
@@ -1003,7 +1003,7 @@
                   <w:r>
                     <w:drawing>
                       <wp:inline xmlns:a="http://schemas.openxmlformats.org/drawingml/2006/main" xmlns:pic="http://schemas.openxmlformats.org/drawingml/2006/picture">
-                        <wp:extent cx="1484985" cy="980236"/>
+                        <wp:extent cx="1484985" cy="987552"/>
                         <wp:docPr id="10" name="Picture 10"/>
                         <wp:cNvGraphicFramePr>
                           <a:graphicFrameLocks noChangeAspect="1"/>
@@ -1024,7 +1024,7 @@
                               <pic:spPr>
                                 <a:xfrm>
                                   <a:off x="0" y="0"/>
-                                  <a:ext cx="1484985" cy="980236"/>
+                                  <a:ext cx="1484985" cy="987552"/>
                                 </a:xfrm>
                                 <a:prstGeom prst="rect"/>
                               </pic:spPr>
@@ -1049,7 +1049,7 @@
                   <w:r>
                     <w:drawing>
                       <wp:inline xmlns:a="http://schemas.openxmlformats.org/drawingml/2006/main" xmlns:pic="http://schemas.openxmlformats.org/drawingml/2006/picture">
-                        <wp:extent cx="1484985" cy="980236"/>
+                        <wp:extent cx="1484985" cy="987552"/>
                         <wp:docPr id="11" name="Picture 11"/>
                         <wp:cNvGraphicFramePr>
                           <a:graphicFrameLocks noChangeAspect="1"/>
@@ -1070,7 +1070,7 @@
                               <pic:spPr>
                                 <a:xfrm>
                                   <a:off x="0" y="0"/>
-                                  <a:ext cx="1484985" cy="980236"/>
+                                  <a:ext cx="1484985" cy="987552"/>
                                 </a:xfrm>
                                 <a:prstGeom prst="rect"/>
                               </pic:spPr>
@@ -1093,7 +1093,7 @@
                   <w:r>
                     <w:drawing>
                       <wp:inline xmlns:a="http://schemas.openxmlformats.org/drawingml/2006/main" xmlns:pic="http://schemas.openxmlformats.org/drawingml/2006/picture">
-                        <wp:extent cx="1484985" cy="980236"/>
+                        <wp:extent cx="1484985" cy="987552"/>
                         <wp:docPr id="12" name="Picture 12"/>
                         <wp:cNvGraphicFramePr>
                           <a:graphicFrameLocks noChangeAspect="1"/>
@@ -1114,7 +1114,7 @@
                               <pic:spPr>
                                 <a:xfrm>
                                   <a:off x="0" y="0"/>
-                                  <a:ext cx="1484985" cy="980236"/>
+                                  <a:ext cx="1484985" cy="987552"/>
                                 </a:xfrm>
                                 <a:prstGeom prst="rect"/>
                               </pic:spPr>
@@ -1188,7 +1188,7 @@
                   <w:r>
                     <w:drawing>
                       <wp:inline xmlns:a="http://schemas.openxmlformats.org/drawingml/2006/main" xmlns:pic="http://schemas.openxmlformats.org/drawingml/2006/picture">
-                        <wp:extent cx="1697126" cy="1155801"/>
+                        <wp:extent cx="1792224" cy="1163117"/>
                         <wp:docPr id="13" name="Picture 13"/>
                         <wp:cNvGraphicFramePr>
                           <a:graphicFrameLocks noChangeAspect="1"/>
@@ -1209,7 +1209,7 @@
                               <pic:spPr>
                                 <a:xfrm>
                                   <a:off x="0" y="0"/>
-                                  <a:ext cx="1697126" cy="1155801"/>
+                                  <a:ext cx="1792224" cy="1163117"/>
                                 </a:xfrm>
                                 <a:prstGeom prst="rect"/>
                               </pic:spPr>
@@ -1232,7 +1232,7 @@
                   <w:r>
                     <w:drawing>
                       <wp:inline xmlns:a="http://schemas.openxmlformats.org/drawingml/2006/main" xmlns:pic="http://schemas.openxmlformats.org/drawingml/2006/picture">
-                        <wp:extent cx="1697126" cy="1155801"/>
+                        <wp:extent cx="1792224" cy="1163117"/>
                         <wp:docPr id="14" name="Picture 14"/>
                         <wp:cNvGraphicFramePr>
                           <a:graphicFrameLocks noChangeAspect="1"/>
@@ -1253,7 +1253,7 @@
                               <pic:spPr>
                                 <a:xfrm>
                                   <a:off x="0" y="0"/>
-                                  <a:ext cx="1697126" cy="1155801"/>
+                                  <a:ext cx="1792224" cy="1163117"/>
                                 </a:xfrm>
                                 <a:prstGeom prst="rect"/>
                               </pic:spPr>
@@ -1278,7 +1278,7 @@
                   <w:r>
                     <w:drawing>
                       <wp:inline xmlns:a="http://schemas.openxmlformats.org/drawingml/2006/main" xmlns:pic="http://schemas.openxmlformats.org/drawingml/2006/picture">
-                        <wp:extent cx="1697126" cy="1155801"/>
+                        <wp:extent cx="1792224" cy="1163117"/>
                         <wp:docPr id="15" name="Picture 15"/>
                         <wp:cNvGraphicFramePr>
                           <a:graphicFrameLocks noChangeAspect="1"/>
@@ -1299,7 +1299,7 @@
                               <pic:spPr>
                                 <a:xfrm>
                                   <a:off x="0" y="0"/>
-                                  <a:ext cx="1697126" cy="1155801"/>
+                                  <a:ext cx="1792224" cy="1163117"/>
                                 </a:xfrm>
                                 <a:prstGeom prst="rect"/>
                               </pic:spPr>
@@ -1322,7 +1322,7 @@
                   <w:r>
                     <w:drawing>
                       <wp:inline xmlns:a="http://schemas.openxmlformats.org/drawingml/2006/main" xmlns:pic="http://schemas.openxmlformats.org/drawingml/2006/picture">
-                        <wp:extent cx="1697126" cy="1155801"/>
+                        <wp:extent cx="1792224" cy="1163117"/>
                         <wp:docPr id="16" name="Picture 16"/>
                         <wp:cNvGraphicFramePr>
                           <a:graphicFrameLocks noChangeAspect="1"/>
@@ -1343,7 +1343,7 @@
                               <pic:spPr>
                                 <a:xfrm>
                                   <a:off x="0" y="0"/>
-                                  <a:ext cx="1697126" cy="1155801"/>
+                                  <a:ext cx="1792224" cy="1163117"/>
                                 </a:xfrm>
                                 <a:prstGeom prst="rect"/>
                               </pic:spPr>
@@ -1404,7 +1404,7 @@
             <w:r>
               <w:drawing>
                 <wp:inline xmlns:a="http://schemas.openxmlformats.org/drawingml/2006/main" xmlns:pic="http://schemas.openxmlformats.org/drawingml/2006/picture">
-                  <wp:extent cx="1367942" cy="1316736"/>
+                  <wp:extent cx="1543507" cy="1316736"/>
                   <wp:docPr id="17" name="Picture 17"/>
                   <wp:cNvGraphicFramePr>
                     <a:graphicFrameLocks noChangeAspect="1"/>
@@ -1425,7 +1425,7 @@
                         <pic:spPr>
                           <a:xfrm>
                             <a:off x="0" y="0"/>
-                            <a:ext cx="1367942" cy="1316736"/>
+                            <a:ext cx="1543507" cy="1316736"/>
                           </a:xfrm>
                           <a:prstGeom prst="rect"/>
                         </pic:spPr>
@@ -1513,7 +1513,7 @@
             <w:r>
               <w:drawing>
                 <wp:inline xmlns:a="http://schemas.openxmlformats.org/drawingml/2006/main" xmlns:pic="http://schemas.openxmlformats.org/drawingml/2006/picture">
-                  <wp:extent cx="5303520" cy="1109472"/>
+                  <wp:extent cx="5303520" cy="1056087"/>
                   <wp:docPr id="18" name="Picture 18"/>
                   <wp:cNvGraphicFramePr>
                     <a:graphicFrameLocks noChangeAspect="1"/>
@@ -1534,7 +1534,7 @@
                         <pic:spPr>
                           <a:xfrm>
                             <a:off x="0" y="0"/>
-                            <a:ext cx="5303520" cy="1109472"/>
+                            <a:ext cx="5303520" cy="1056087"/>
                           </a:xfrm>
                           <a:prstGeom prst="rect"/>
                         </pic:spPr>
@@ -1622,7 +1622,7 @@
             <w:r>
               <w:drawing>
                 <wp:inline xmlns:a="http://schemas.openxmlformats.org/drawingml/2006/main" xmlns:pic="http://schemas.openxmlformats.org/drawingml/2006/picture">
-                  <wp:extent cx="2582265" cy="936345"/>
+                  <wp:extent cx="2757830" cy="936345"/>
                   <wp:docPr id="19" name="Picture 19"/>
                   <wp:cNvGraphicFramePr>
                     <a:graphicFrameLocks noChangeAspect="1"/>
@@ -1643,7 +1643,7 @@
                         <pic:spPr>
                           <a:xfrm>
                             <a:off x="0" y="0"/>
-                            <a:ext cx="2582265" cy="936345"/>
+                            <a:ext cx="2757830" cy="936345"/>
                           </a:xfrm>
                           <a:prstGeom prst="rect"/>
                         </pic:spPr>
@@ -1744,7 +1744,7 @@
                   <w:r>
                     <w:drawing>
                       <wp:inline xmlns:a="http://schemas.openxmlformats.org/drawingml/2006/main" xmlns:pic="http://schemas.openxmlformats.org/drawingml/2006/picture">
-                        <wp:extent cx="1389888" cy="980237"/>
+                        <wp:extent cx="1484985" cy="987552"/>
                         <wp:docPr id="20" name="Picture 20"/>
                         <wp:cNvGraphicFramePr>
                           <a:graphicFrameLocks noChangeAspect="1"/>
@@ -1765,7 +1765,7 @@
                               <pic:spPr>
                                 <a:xfrm>
                                   <a:off x="0" y="0"/>
-                                  <a:ext cx="1389888" cy="980237"/>
+                                  <a:ext cx="1484985" cy="987552"/>
                                 </a:xfrm>
                                 <a:prstGeom prst="rect"/>
                               </pic:spPr>
@@ -1788,7 +1788,7 @@
                   <w:r>
                     <w:drawing>
                       <wp:inline xmlns:a="http://schemas.openxmlformats.org/drawingml/2006/main" xmlns:pic="http://schemas.openxmlformats.org/drawingml/2006/picture">
-                        <wp:extent cx="1389888" cy="1331366"/>
+                        <wp:extent cx="1572768" cy="1338682"/>
                         <wp:docPr id="21" name="Picture 21"/>
                         <wp:cNvGraphicFramePr>
                           <a:graphicFrameLocks noChangeAspect="1"/>
@@ -1809,7 +1809,7 @@
                               <pic:spPr>
                                 <a:xfrm>
                                   <a:off x="0" y="0"/>
-                                  <a:ext cx="1389888" cy="1331366"/>
+                                  <a:ext cx="1572768" cy="1338682"/>
                                 </a:xfrm>
                                 <a:prstGeom prst="rect"/>
                               </pic:spPr>
@@ -1834,7 +1834,7 @@
                   <w:r>
                     <w:drawing>
                       <wp:inline xmlns:a="http://schemas.openxmlformats.org/drawingml/2006/main" xmlns:pic="http://schemas.openxmlformats.org/drawingml/2006/picture">
-                        <wp:extent cx="1389888" cy="1331366"/>
+                        <wp:extent cx="1572768" cy="1338682"/>
                         <wp:docPr id="22" name="Picture 22"/>
                         <wp:cNvGraphicFramePr>
                           <a:graphicFrameLocks noChangeAspect="1"/>
@@ -1855,7 +1855,7 @@
                               <pic:spPr>
                                 <a:xfrm>
                                   <a:off x="0" y="0"/>
-                                  <a:ext cx="1389888" cy="1331366"/>
+                                  <a:ext cx="1572768" cy="1338682"/>
                                 </a:xfrm>
                                 <a:prstGeom prst="rect"/>
                               </pic:spPr>
@@ -1878,7 +1878,7 @@
                   <w:r>
                     <w:drawing>
                       <wp:inline xmlns:a="http://schemas.openxmlformats.org/drawingml/2006/main" xmlns:pic="http://schemas.openxmlformats.org/drawingml/2006/picture">
-                        <wp:extent cx="1389888" cy="1331366"/>
+                        <wp:extent cx="1572768" cy="1338682"/>
                         <wp:docPr id="23" name="Picture 23"/>
                         <wp:cNvGraphicFramePr>
                           <a:graphicFrameLocks noChangeAspect="1"/>
@@ -1899,7 +1899,7 @@
                               <pic:spPr>
                                 <a:xfrm>
                                   <a:off x="0" y="0"/>
-                                  <a:ext cx="1389888" cy="1331366"/>
+                                  <a:ext cx="1572768" cy="1338682"/>
                                 </a:xfrm>
                                 <a:prstGeom prst="rect"/>
                               </pic:spPr>
@@ -1960,7 +1960,7 @@
             <w:r>
               <w:drawing>
                 <wp:inline xmlns:a="http://schemas.openxmlformats.org/drawingml/2006/main" xmlns:pic="http://schemas.openxmlformats.org/drawingml/2006/picture">
-                  <wp:extent cx="2582265" cy="1155801"/>
+                  <wp:extent cx="2757830" cy="1155801"/>
                   <wp:docPr id="24" name="Picture 24"/>
                   <wp:cNvGraphicFramePr>
                     <a:graphicFrameLocks noChangeAspect="1"/>
@@ -1981,7 +1981,7 @@
                         <pic:spPr>
                           <a:xfrm>
                             <a:off x="0" y="0"/>
-                            <a:ext cx="2582265" cy="1155801"/>
+                            <a:ext cx="2757830" cy="1155801"/>
                           </a:xfrm>
                           <a:prstGeom prst="rect"/>
                         </pic:spPr>
@@ -2082,7 +2082,7 @@
                   <w:r>
                     <w:drawing>
                       <wp:inline xmlns:a="http://schemas.openxmlformats.org/drawingml/2006/main" xmlns:pic="http://schemas.openxmlformats.org/drawingml/2006/picture">
-                        <wp:extent cx="2304288" cy="833933"/>
+                        <wp:extent cx="2311603" cy="833933"/>
                         <wp:docPr id="25" name="Picture 25"/>
                         <wp:cNvGraphicFramePr>
                           <a:graphicFrameLocks noChangeAspect="1"/>
@@ -2103,7 +2103,7 @@
                               <pic:spPr>
                                 <a:xfrm>
                                   <a:off x="0" y="0"/>
-                                  <a:ext cx="2304288" cy="833933"/>
+                                  <a:ext cx="2311603" cy="833933"/>
                                 </a:xfrm>
                                 <a:prstGeom prst="rect"/>
                               </pic:spPr>
@@ -2126,7 +2126,7 @@
                   <w:r>
                     <w:drawing>
                       <wp:inline xmlns:a="http://schemas.openxmlformats.org/drawingml/2006/main" xmlns:pic="http://schemas.openxmlformats.org/drawingml/2006/picture">
-                        <wp:extent cx="2304288" cy="658368"/>
+                        <wp:extent cx="2311603" cy="658368"/>
                         <wp:docPr id="26" name="Picture 26"/>
                         <wp:cNvGraphicFramePr>
                           <a:graphicFrameLocks noChangeAspect="1"/>
@@ -2147,7 +2147,7 @@
                               <pic:spPr>
                                 <a:xfrm>
                                   <a:off x="0" y="0"/>
-                                  <a:ext cx="2304288" cy="658368"/>
+                                  <a:ext cx="2311603" cy="658368"/>
                                 </a:xfrm>
                                 <a:prstGeom prst="rect"/>
                               </pic:spPr>
@@ -2172,7 +2172,7 @@
                   <w:r>
                     <w:drawing>
                       <wp:inline xmlns:a="http://schemas.openxmlformats.org/drawingml/2006/main" xmlns:pic="http://schemas.openxmlformats.org/drawingml/2006/picture">
-                        <wp:extent cx="2304288" cy="629107"/>
+                        <wp:extent cx="2311603" cy="636422"/>
                         <wp:docPr id="27" name="Picture 27"/>
                         <wp:cNvGraphicFramePr>
                           <a:graphicFrameLocks noChangeAspect="1"/>
@@ -2193,7 +2193,7 @@
                               <pic:spPr>
                                 <a:xfrm>
                                   <a:off x="0" y="0"/>
-                                  <a:ext cx="2304288" cy="629107"/>
+                                  <a:ext cx="2311603" cy="636422"/>
                                 </a:xfrm>
                                 <a:prstGeom prst="rect"/>
                               </pic:spPr>
@@ -2343,7 +2343,7 @@
             <w:r>
               <w:drawing>
                 <wp:inline xmlns:a="http://schemas.openxmlformats.org/drawingml/2006/main" xmlns:pic="http://schemas.openxmlformats.org/drawingml/2006/picture">
-                  <wp:extent cx="3599078" cy="629107"/>
+                  <wp:extent cx="3781958" cy="636422"/>
                   <wp:docPr id="28" name="Picture 28"/>
                   <wp:cNvGraphicFramePr>
                     <a:graphicFrameLocks noChangeAspect="1"/>
@@ -2364,7 +2364,7 @@
                         <pic:spPr>
                           <a:xfrm>
                             <a:off x="0" y="0"/>
-                            <a:ext cx="3599078" cy="629107"/>
+                            <a:ext cx="3781958" cy="636422"/>
                           </a:xfrm>
                           <a:prstGeom prst="rect"/>
                         </pic:spPr>
@@ -2452,7 +2452,7 @@
             <w:r>
               <w:drawing>
                 <wp:inline xmlns:a="http://schemas.openxmlformats.org/drawingml/2006/main" xmlns:pic="http://schemas.openxmlformats.org/drawingml/2006/picture">
-                  <wp:extent cx="2889504" cy="980237"/>
+                  <wp:extent cx="3065068" cy="987552"/>
                   <wp:docPr id="29" name="Picture 29"/>
                   <wp:cNvGraphicFramePr>
                     <a:graphicFrameLocks noChangeAspect="1"/>
@@ -2473,7 +2473,7 @@
                         <pic:spPr>
                           <a:xfrm>
                             <a:off x="0" y="0"/>
-                            <a:ext cx="2889504" cy="980237"/>
+                            <a:ext cx="3065068" cy="987552"/>
                           </a:xfrm>
                           <a:prstGeom prst="rect"/>
                         </pic:spPr>
@@ -2561,7 +2561,7 @@
             <w:r>
               <w:drawing>
                 <wp:inline xmlns:a="http://schemas.openxmlformats.org/drawingml/2006/main" xmlns:pic="http://schemas.openxmlformats.org/drawingml/2006/picture">
-                  <wp:extent cx="2282342" cy="980237"/>
+                  <wp:extent cx="2457907" cy="980237"/>
                   <wp:docPr id="30" name="Picture 30"/>
                   <wp:cNvGraphicFramePr>
                     <a:graphicFrameLocks noChangeAspect="1"/>
@@ -2582,7 +2582,7 @@
                         <pic:spPr>
                           <a:xfrm>
                             <a:off x="0" y="0"/>
-                            <a:ext cx="2282342" cy="980237"/>
+                            <a:ext cx="2457907" cy="980237"/>
                           </a:xfrm>
                           <a:prstGeom prst="rect"/>
                         </pic:spPr>
@@ -2670,7 +2670,7 @@
             <w:r>
               <w:drawing>
                 <wp:inline xmlns:a="http://schemas.openxmlformats.org/drawingml/2006/main" xmlns:pic="http://schemas.openxmlformats.org/drawingml/2006/picture">
-                  <wp:extent cx="4542739" cy="980237"/>
+                  <wp:extent cx="4893868" cy="987552"/>
                   <wp:docPr id="31" name="Picture 31"/>
                   <wp:cNvGraphicFramePr>
                     <a:graphicFrameLocks noChangeAspect="1"/>
@@ -2691,7 +2691,7 @@
                         <pic:spPr>
                           <a:xfrm>
                             <a:off x="0" y="0"/>
-                            <a:ext cx="4542739" cy="980237"/>
+                            <a:ext cx="4893868" cy="987552"/>
                           </a:xfrm>
                           <a:prstGeom prst="rect"/>
                         </pic:spPr>
@@ -2779,7 +2779,7 @@
             <w:r>
               <w:drawing>
                 <wp:inline xmlns:a="http://schemas.openxmlformats.org/drawingml/2006/main" xmlns:pic="http://schemas.openxmlformats.org/drawingml/2006/picture">
-                  <wp:extent cx="2282342" cy="2033625"/>
+                  <wp:extent cx="2457907" cy="2033625"/>
                   <wp:docPr id="32" name="Picture 32"/>
                   <wp:cNvGraphicFramePr>
                     <a:graphicFrameLocks noChangeAspect="1"/>
@@ -2800,7 +2800,7 @@
                         <pic:spPr>
                           <a:xfrm>
                             <a:off x="0" y="0"/>
-                            <a:ext cx="2282342" cy="2033625"/>
+                            <a:ext cx="2457907" cy="2033625"/>
                           </a:xfrm>
                           <a:prstGeom prst="rect"/>
                         </pic:spPr>
@@ -2888,7 +2888,7 @@
             <w:r>
               <w:drawing>
                 <wp:inline xmlns:a="http://schemas.openxmlformats.org/drawingml/2006/main" xmlns:pic="http://schemas.openxmlformats.org/drawingml/2006/picture">
-                  <wp:extent cx="5303520" cy="974858"/>
+                  <wp:extent cx="5303520" cy="935915"/>
                   <wp:docPr id="33" name="Picture 33"/>
                   <wp:cNvGraphicFramePr>
                     <a:graphicFrameLocks noChangeAspect="1"/>
@@ -2909,7 +2909,7 @@
                         <pic:spPr>
                           <a:xfrm>
                             <a:off x="0" y="0"/>
-                            <a:ext cx="5303520" cy="974858"/>
+                            <a:ext cx="5303520" cy="935915"/>
                           </a:xfrm>
                           <a:prstGeom prst="rect"/>
                         </pic:spPr>
@@ -2997,7 +2997,7 @@
             <w:r>
               <w:drawing>
                 <wp:inline xmlns:a="http://schemas.openxmlformats.org/drawingml/2006/main" xmlns:pic="http://schemas.openxmlformats.org/drawingml/2006/picture">
-                  <wp:extent cx="4447641" cy="629107"/>
+                  <wp:extent cx="4754880" cy="636422"/>
                   <wp:docPr id="34" name="Picture 34"/>
                   <wp:cNvGraphicFramePr>
                     <a:graphicFrameLocks noChangeAspect="1"/>
@@ -3018,7 +3018,7 @@
                         <pic:spPr>
                           <a:xfrm>
                             <a:off x="0" y="0"/>
-                            <a:ext cx="4447641" cy="629107"/>
+                            <a:ext cx="4754880" cy="636422"/>
                           </a:xfrm>
                           <a:prstGeom prst="rect"/>
                         </pic:spPr>
@@ -3106,7 +3106,7 @@
             <w:r>
               <w:drawing>
                 <wp:inline xmlns:a="http://schemas.openxmlformats.org/drawingml/2006/main" xmlns:pic="http://schemas.openxmlformats.org/drawingml/2006/picture">
-                  <wp:extent cx="5303520" cy="936326"/>
+                  <wp:extent cx="5303520" cy="867731"/>
                   <wp:docPr id="35" name="Picture 35"/>
                   <wp:cNvGraphicFramePr>
                     <a:graphicFrameLocks noChangeAspect="1"/>
@@ -3127,7 +3127,7 @@
                         <pic:spPr>
                           <a:xfrm>
                             <a:off x="0" y="0"/>
-                            <a:ext cx="5303520" cy="936326"/>
+                            <a:ext cx="5303520" cy="867731"/>
                           </a:xfrm>
                           <a:prstGeom prst="rect"/>
                         </pic:spPr>
@@ -3215,7 +3215,7 @@
             <w:r>
               <w:drawing>
                 <wp:inline xmlns:a="http://schemas.openxmlformats.org/drawingml/2006/main" xmlns:pic="http://schemas.openxmlformats.org/drawingml/2006/picture">
-                  <wp:extent cx="5303520" cy="1047445"/>
+                  <wp:extent cx="5303520" cy="994410"/>
                   <wp:docPr id="36" name="Picture 36"/>
                   <wp:cNvGraphicFramePr>
                     <a:graphicFrameLocks noChangeAspect="1"/>
@@ -3236,7 +3236,7 @@
                         <pic:spPr>
                           <a:xfrm>
                             <a:off x="0" y="0"/>
-                            <a:ext cx="5303520" cy="1047445"/>
+                            <a:ext cx="5303520" cy="994410"/>
                           </a:xfrm>
                           <a:prstGeom prst="rect"/>
                         </pic:spPr>
@@ -3324,7 +3324,7 @@
             <w:r>
               <w:drawing>
                 <wp:inline xmlns:a="http://schemas.openxmlformats.org/drawingml/2006/main" xmlns:pic="http://schemas.openxmlformats.org/drawingml/2006/picture">
-                  <wp:extent cx="5303520" cy="959071"/>
+                  <wp:extent cx="5303520" cy="906298"/>
                   <wp:docPr id="37" name="Picture 37"/>
                   <wp:cNvGraphicFramePr>
                     <a:graphicFrameLocks noChangeAspect="1"/>
@@ -3345,7 +3345,7 @@
                         <pic:spPr>
                           <a:xfrm>
                             <a:off x="0" y="0"/>
-                            <a:ext cx="5303520" cy="959071"/>
+                            <a:ext cx="5303520" cy="906298"/>
                           </a:xfrm>
                           <a:prstGeom prst="rect"/>
                         </pic:spPr>
@@ -3446,7 +3446,7 @@
                   <w:r>
                     <w:drawing>
                       <wp:inline xmlns:a="http://schemas.openxmlformats.org/drawingml/2006/main" xmlns:pic="http://schemas.openxmlformats.org/drawingml/2006/picture">
-                        <wp:extent cx="2834640" cy="1262090"/>
+                        <wp:extent cx="2834640" cy="1177950"/>
                         <wp:docPr id="38" name="Picture 38"/>
                         <wp:cNvGraphicFramePr>
                           <a:graphicFrameLocks noChangeAspect="1"/>
@@ -3467,7 +3467,7 @@
                               <pic:spPr>
                                 <a:xfrm>
                                   <a:off x="0" y="0"/>
-                                  <a:ext cx="2834640" cy="1262090"/>
+                                  <a:ext cx="2834640" cy="1177950"/>
                                 </a:xfrm>
                                 <a:prstGeom prst="rect"/>
                               </pic:spPr>
@@ -3490,7 +3490,7 @@
                   <w:r>
                     <w:drawing>
                       <wp:inline xmlns:a="http://schemas.openxmlformats.org/drawingml/2006/main" xmlns:pic="http://schemas.openxmlformats.org/drawingml/2006/picture">
-                        <wp:extent cx="2834640" cy="1268839"/>
+                        <wp:extent cx="2834640" cy="1184250"/>
                         <wp:docPr id="39" name="Picture 39"/>
                         <wp:cNvGraphicFramePr>
                           <a:graphicFrameLocks noChangeAspect="1"/>
@@ -3511,7 +3511,7 @@
                               <pic:spPr>
                                 <a:xfrm>
                                   <a:off x="0" y="0"/>
-                                  <a:ext cx="2834640" cy="1268839"/>
+                                  <a:ext cx="2834640" cy="1184250"/>
                                 </a:xfrm>
                                 <a:prstGeom prst="rect"/>
                               </pic:spPr>
@@ -3536,7 +3536,7 @@
                   <w:r>
                     <w:drawing>
                       <wp:inline xmlns:a="http://schemas.openxmlformats.org/drawingml/2006/main" xmlns:pic="http://schemas.openxmlformats.org/drawingml/2006/picture">
-                        <wp:extent cx="2834640" cy="1262090"/>
+                        <wp:extent cx="2834640" cy="1177950"/>
                         <wp:docPr id="40" name="Picture 40"/>
                         <wp:cNvGraphicFramePr>
                           <a:graphicFrameLocks noChangeAspect="1"/>
@@ -3557,7 +3557,7 @@
                               <pic:spPr>
                                 <a:xfrm>
                                   <a:off x="0" y="0"/>
-                                  <a:ext cx="2834640" cy="1262090"/>
+                                  <a:ext cx="2834640" cy="1177950"/>
                                 </a:xfrm>
                                 <a:prstGeom prst="rect"/>
                               </pic:spPr>
@@ -3580,7 +3580,7 @@
                   <w:r>
                     <w:drawing>
                       <wp:inline xmlns:a="http://schemas.openxmlformats.org/drawingml/2006/main" xmlns:pic="http://schemas.openxmlformats.org/drawingml/2006/picture">
-                        <wp:extent cx="2834640" cy="1262090"/>
+                        <wp:extent cx="2834640" cy="1177950"/>
                         <wp:docPr id="41" name="Picture 41"/>
                         <wp:cNvGraphicFramePr>
                           <a:graphicFrameLocks noChangeAspect="1"/>
@@ -3601,7 +3601,7 @@
                               <pic:spPr>
                                 <a:xfrm>
                                   <a:off x="0" y="0"/>
-                                  <a:ext cx="2834640" cy="1262090"/>
+                                  <a:ext cx="2834640" cy="1177950"/>
                                 </a:xfrm>
                                 <a:prstGeom prst="rect"/>
                               </pic:spPr>
@@ -3662,7 +3662,7 @@
             <w:r>
               <w:drawing>
                 <wp:inline xmlns:a="http://schemas.openxmlformats.org/drawingml/2006/main" xmlns:pic="http://schemas.openxmlformats.org/drawingml/2006/picture">
-                  <wp:extent cx="5303520" cy="592476"/>
+                  <wp:extent cx="5303520" cy="590542"/>
                   <wp:docPr id="42" name="Picture 42"/>
                   <wp:cNvGraphicFramePr>
                     <a:graphicFrameLocks noChangeAspect="1"/>
@@ -3683,7 +3683,7 @@
                         <pic:spPr>
                           <a:xfrm>
                             <a:off x="0" y="0"/>
-                            <a:ext cx="5303520" cy="592476"/>
+                            <a:ext cx="5303520" cy="590542"/>
                           </a:xfrm>
                           <a:prstGeom prst="rect"/>
                         </pic:spPr>
@@ -3784,7 +3784,7 @@
                   <w:r>
                     <w:drawing>
                       <wp:inline xmlns:a="http://schemas.openxmlformats.org/drawingml/2006/main" xmlns:pic="http://schemas.openxmlformats.org/drawingml/2006/picture">
-                        <wp:extent cx="1484985" cy="980236"/>
+                        <wp:extent cx="1484985" cy="987552"/>
                         <wp:docPr id="43" name="Picture 43"/>
                         <wp:cNvGraphicFramePr>
                           <a:graphicFrameLocks noChangeAspect="1"/>
@@ -3805,7 +3805,7 @@
                               <pic:spPr>
                                 <a:xfrm>
                                   <a:off x="0" y="0"/>
-                                  <a:ext cx="1484985" cy="980236"/>
+                                  <a:ext cx="1484985" cy="987552"/>
                                 </a:xfrm>
                                 <a:prstGeom prst="rect"/>
                               </pic:spPr>
@@ -3828,7 +3828,7 @@
                   <w:r>
                     <w:drawing>
                       <wp:inline xmlns:a="http://schemas.openxmlformats.org/drawingml/2006/main" xmlns:pic="http://schemas.openxmlformats.org/drawingml/2006/picture">
-                        <wp:extent cx="1397203" cy="863193"/>
+                        <wp:extent cx="1484985" cy="870508"/>
                         <wp:docPr id="44" name="Picture 44"/>
                         <wp:cNvGraphicFramePr>
                           <a:graphicFrameLocks noChangeAspect="1"/>
@@ -3849,7 +3849,7 @@
                               <pic:spPr>
                                 <a:xfrm>
                                   <a:off x="0" y="0"/>
-                                  <a:ext cx="1397203" cy="863193"/>
+                                  <a:ext cx="1484985" cy="870508"/>
                                 </a:xfrm>
                                 <a:prstGeom prst="rect"/>
                               </pic:spPr>
@@ -3874,7 +3874,7 @@
                   <w:r>
                     <w:drawing>
                       <wp:inline xmlns:a="http://schemas.openxmlformats.org/drawingml/2006/main" xmlns:pic="http://schemas.openxmlformats.org/drawingml/2006/picture">
-                        <wp:extent cx="1697126" cy="1155801"/>
+                        <wp:extent cx="1792224" cy="1163117"/>
                         <wp:docPr id="45" name="Picture 45"/>
                         <wp:cNvGraphicFramePr>
                           <a:graphicFrameLocks noChangeAspect="1"/>
@@ -3895,7 +3895,7 @@
                               <pic:spPr>
                                 <a:xfrm>
                                   <a:off x="0" y="0"/>
-                                  <a:ext cx="1697126" cy="1155801"/>
+                                  <a:ext cx="1792224" cy="1163117"/>
                                 </a:xfrm>
                                 <a:prstGeom prst="rect"/>
                               </pic:spPr>
@@ -3918,7 +3918,7 @@
                   <w:r>
                     <w:drawing>
                       <wp:inline xmlns:a="http://schemas.openxmlformats.org/drawingml/2006/main" xmlns:pic="http://schemas.openxmlformats.org/drawingml/2006/picture">
-                        <wp:extent cx="1185062" cy="504749"/>
+                        <wp:extent cx="1228953" cy="504749"/>
                         <wp:docPr id="46" name="Picture 46"/>
                         <wp:cNvGraphicFramePr>
                           <a:graphicFrameLocks noChangeAspect="1"/>
@@ -3939,7 +3939,7 @@
                               <pic:spPr>
                                 <a:xfrm>
                                   <a:off x="0" y="0"/>
-                                  <a:ext cx="1185062" cy="504749"/>
+                                  <a:ext cx="1228953" cy="504749"/>
                                 </a:xfrm>
                                 <a:prstGeom prst="rect"/>
                               </pic:spPr>
@@ -4000,7 +4000,7 @@
             <w:r>
               <w:drawing>
                 <wp:inline xmlns:a="http://schemas.openxmlformats.org/drawingml/2006/main" xmlns:pic="http://schemas.openxmlformats.org/drawingml/2006/picture">
-                  <wp:extent cx="1667865" cy="980236"/>
+                  <wp:extent cx="1675180" cy="987552"/>
                   <wp:docPr id="47" name="Picture 47"/>
                   <wp:cNvGraphicFramePr>
                     <a:graphicFrameLocks noChangeAspect="1"/>
@@ -4021,7 +4021,7 @@
                         <pic:spPr>
                           <a:xfrm>
                             <a:off x="0" y="0"/>
-                            <a:ext cx="1667865" cy="980236"/>
+                            <a:ext cx="1675180" cy="987552"/>
                           </a:xfrm>
                           <a:prstGeom prst="rect"/>
                         </pic:spPr>
@@ -4109,7 +4109,7 @@
             <w:r>
               <w:drawing>
                 <wp:inline xmlns:a="http://schemas.openxmlformats.org/drawingml/2006/main" xmlns:pic="http://schemas.openxmlformats.org/drawingml/2006/picture">
-                  <wp:extent cx="1975104" cy="980237"/>
+                  <wp:extent cx="1975104" cy="987552"/>
                   <wp:docPr id="48" name="Picture 48"/>
                   <wp:cNvGraphicFramePr>
                     <a:graphicFrameLocks noChangeAspect="1"/>
@@ -4130,7 +4130,7 @@
                         <pic:spPr>
                           <a:xfrm>
                             <a:off x="0" y="0"/>
-                            <a:ext cx="1975104" cy="980237"/>
+                            <a:ext cx="1975104" cy="987552"/>
                           </a:xfrm>
                           <a:prstGeom prst="rect"/>
                         </pic:spPr>
@@ -4327,7 +4327,7 @@
             <w:r>
               <w:drawing>
                 <wp:inline xmlns:a="http://schemas.openxmlformats.org/drawingml/2006/main" xmlns:pic="http://schemas.openxmlformats.org/drawingml/2006/picture">
-                  <wp:extent cx="1667865" cy="1331366"/>
+                  <wp:extent cx="1675180" cy="1338681"/>
                   <wp:docPr id="50" name="Picture 50"/>
                   <wp:cNvGraphicFramePr>
                     <a:graphicFrameLocks noChangeAspect="1"/>
@@ -4348,7 +4348,7 @@
                         <pic:spPr>
                           <a:xfrm>
                             <a:off x="0" y="0"/>
-                            <a:ext cx="1667865" cy="1331366"/>
+                            <a:ext cx="1675180" cy="1338681"/>
                           </a:xfrm>
                           <a:prstGeom prst="rect"/>
                         </pic:spPr>
@@ -4436,7 +4436,7 @@
             <w:r>
               <w:drawing>
                 <wp:inline xmlns:a="http://schemas.openxmlformats.org/drawingml/2006/main" xmlns:pic="http://schemas.openxmlformats.org/drawingml/2006/picture">
-                  <wp:extent cx="1367942" cy="1506931"/>
+                  <wp:extent cx="1367942" cy="1514246"/>
                   <wp:docPr id="51" name="Picture 51"/>
                   <wp:cNvGraphicFramePr>
                     <a:graphicFrameLocks noChangeAspect="1"/>
@@ -4457,7 +4457,7 @@
                         <pic:spPr>
                           <a:xfrm>
                             <a:off x="0" y="0"/>
-                            <a:ext cx="1367942" cy="1506931"/>
+                            <a:ext cx="1367942" cy="1514246"/>
                           </a:xfrm>
                           <a:prstGeom prst="rect"/>
                         </pic:spPr>
@@ -4545,7 +4545,7 @@
             <w:r>
               <w:drawing>
                 <wp:inline xmlns:a="http://schemas.openxmlformats.org/drawingml/2006/main" xmlns:pic="http://schemas.openxmlformats.org/drawingml/2006/picture">
-                  <wp:extent cx="1367942" cy="1858060"/>
+                  <wp:extent cx="1367942" cy="1865375"/>
                   <wp:docPr id="52" name="Picture 52"/>
                   <wp:cNvGraphicFramePr>
                     <a:graphicFrameLocks noChangeAspect="1"/>
@@ -4566,7 +4566,7 @@
                         <pic:spPr>
                           <a:xfrm>
                             <a:off x="0" y="0"/>
-                            <a:ext cx="1367942" cy="1858060"/>
+                            <a:ext cx="1367942" cy="1865375"/>
                           </a:xfrm>
                           <a:prstGeom prst="rect"/>
                         </pic:spPr>
@@ -4654,7 +4654,7 @@
             <w:r>
               <w:drawing>
                 <wp:inline xmlns:a="http://schemas.openxmlformats.org/drawingml/2006/main" xmlns:pic="http://schemas.openxmlformats.org/drawingml/2006/picture">
-                  <wp:extent cx="1667865" cy="980236"/>
+                  <wp:extent cx="1675180" cy="987552"/>
                   <wp:docPr id="53" name="Picture 53"/>
                   <wp:cNvGraphicFramePr>
                     <a:graphicFrameLocks noChangeAspect="1"/>
@@ -4675,7 +4675,7 @@
                         <pic:spPr>
                           <a:xfrm>
                             <a:off x="0" y="0"/>
-                            <a:ext cx="1667865" cy="980236"/>
+                            <a:ext cx="1675180" cy="987552"/>
                           </a:xfrm>
                           <a:prstGeom prst="rect"/>
                         </pic:spPr>
@@ -4763,7 +4763,7 @@
             <w:r>
               <w:drawing>
                 <wp:inline xmlns:a="http://schemas.openxmlformats.org/drawingml/2006/main" xmlns:pic="http://schemas.openxmlformats.org/drawingml/2006/picture">
-                  <wp:extent cx="1667865" cy="1506931"/>
+                  <wp:extent cx="1675180" cy="1514246"/>
                   <wp:docPr id="54" name="Picture 54"/>
                   <wp:cNvGraphicFramePr>
                     <a:graphicFrameLocks noChangeAspect="1"/>
@@ -4784,7 +4784,7 @@
                         <pic:spPr>
                           <a:xfrm>
                             <a:off x="0" y="0"/>
-                            <a:ext cx="1667865" cy="1506931"/>
+                            <a:ext cx="1675180" cy="1514246"/>
                           </a:xfrm>
                           <a:prstGeom prst="rect"/>
                         </pic:spPr>
@@ -4872,7 +4872,7 @@
             <w:r>
               <w:drawing>
                 <wp:inline xmlns:a="http://schemas.openxmlformats.org/drawingml/2006/main" xmlns:pic="http://schemas.openxmlformats.org/drawingml/2006/picture">
-                  <wp:extent cx="1975104" cy="1331366"/>
+                  <wp:extent cx="1975104" cy="1338682"/>
                   <wp:docPr id="55" name="Picture 55"/>
                   <wp:cNvGraphicFramePr>
                     <a:graphicFrameLocks noChangeAspect="1"/>
@@ -4893,7 +4893,7 @@
                         <pic:spPr>
                           <a:xfrm>
                             <a:off x="0" y="0"/>
-                            <a:ext cx="1975104" cy="1331366"/>
+                            <a:ext cx="1975104" cy="1338682"/>
                           </a:xfrm>
                           <a:prstGeom prst="rect"/>
                         </pic:spPr>
@@ -5038,7 +5038,7 @@
                   <w:r>
                     <w:drawing>
                       <wp:inline xmlns:a="http://schemas.openxmlformats.org/drawingml/2006/main" xmlns:pic="http://schemas.openxmlformats.org/drawingml/2006/picture">
-                        <wp:extent cx="2004364" cy="1331366"/>
+                        <wp:extent cx="2004364" cy="1338681"/>
                         <wp:docPr id="57" name="Picture 57"/>
                         <wp:cNvGraphicFramePr>
                           <a:graphicFrameLocks noChangeAspect="1"/>
@@ -5059,7 +5059,7 @@
                               <pic:spPr>
                                 <a:xfrm>
                                   <a:off x="0" y="0"/>
-                                  <a:ext cx="2004364" cy="1331366"/>
+                                  <a:ext cx="2004364" cy="1338681"/>
                                 </a:xfrm>
                                 <a:prstGeom prst="rect"/>
                               </pic:spPr>
@@ -5084,7 +5084,7 @@
                   <w:r>
                     <w:drawing>
                       <wp:inline xmlns:a="http://schemas.openxmlformats.org/drawingml/2006/main" xmlns:pic="http://schemas.openxmlformats.org/drawingml/2006/picture">
-                        <wp:extent cx="2004364" cy="980236"/>
+                        <wp:extent cx="2004364" cy="987552"/>
                         <wp:docPr id="58" name="Picture 58"/>
                         <wp:cNvGraphicFramePr>
                           <a:graphicFrameLocks noChangeAspect="1"/>
@@ -5105,7 +5105,7 @@
                               <pic:spPr>
                                 <a:xfrm>
                                   <a:off x="0" y="0"/>
-                                  <a:ext cx="2004364" cy="980236"/>
+                                  <a:ext cx="2004364" cy="987552"/>
                                 </a:xfrm>
                                 <a:prstGeom prst="rect"/>
                               </pic:spPr>

</xml_diff>